<commit_message>
Rename Growth System packages: Ripple→Launch™, Current→Momentum™, Surge→Accelerate™ across all documents and files
</commit_message>
<xml_diff>
--- a/document/bluwav-bible/document.docx
+++ b/document/bluwav-bible/document.docx
@@ -1094,7 +1094,7 @@
           <w:sz w:val="24"/>
           <w:szCs w:val="24"/>
         </w:rPr>
-        <w:t xml:space="preserve">CRM Premium clients get every upgrade, every month.</w:t>
+        <w:t xml:space="preserve">Founder Plan™ clients get every upgrade, every month.</w:t>
       </w:r>
     </w:p>
     <w:p>
@@ -3027,7 +3027,7 @@
           <w:sz w:val="24"/>
           <w:szCs w:val="24"/>
         </w:rPr>
-        <w:t xml:space="preserve">CRM Premium evolves every month — new features, new dashboards, new automation templates.</w:t>
+        <w:t xml:space="preserve">Founder Plan™ evolves every month — new features, new dashboards, new automation templates.</w:t>
       </w:r>
     </w:p>
     <w:p>
@@ -3389,31 +3389,31 @@
                 <w:sz w:val="20"/>
                 <w:szCs w:val="20"/>
               </w:rPr>
-              <w:t xml:space="preserve">Ripple $1,800 / Current $3,000 / Surge $5,000+</w:t>
-            </w:r>
-          </w:p>
-        </w:tc>
-      </w:tr>
-      <w:tr>
-        <w:tc>
-          <w:tcPr>
-            <w:tcW w:type="dxa" w:w="4680"/>
-            <w:tcBorders>
-              <w:top w:val="none" w:color="FFFFFF" w:sz="0"/>
-              <w:left w:val="none" w:color="FFFFFF" w:sz="0"/>
-              <w:bottom w:val="none" w:color="FFFFFF" w:sz="0"/>
-              <w:right w:val="none" w:color="FFFFFF" w:sz="0"/>
-            </w:tcBorders>
-            <w:shd w:fill="F8FBFF" w:color="auto" w:val="clear"/>
-          </w:tcPr>
-          <w:p>
-            <w:r>
-              <w:rPr>
-                <w:rFonts w:ascii="Cambria" w:cs="Cambria" w:eastAsia="Cambria" w:hAnsi="Cambria"/>
-                <w:sz w:val="20"/>
-                <w:szCs w:val="20"/>
-              </w:rPr>
-              <w:t xml:space="preserve">CRM Starter</w:t>
+              <w:t xml:space="preserve">Launch™ $900 setup / Momentum™ $1,250 setup / Accelerate™ $2,500 setup</w:t>
+            </w:r>
+          </w:p>
+        </w:tc>
+      </w:tr>
+      <w:tr>
+        <w:tc>
+          <w:tcPr>
+            <w:tcW w:type="dxa" w:w="4680"/>
+            <w:tcBorders>
+              <w:top w:val="none" w:color="FFFFFF" w:sz="0"/>
+              <w:left w:val="none" w:color="FFFFFF" w:sz="0"/>
+              <w:bottom w:val="none" w:color="FFFFFF" w:sz="0"/>
+              <w:right w:val="none" w:color="FFFFFF" w:sz="0"/>
+            </w:tcBorders>
+            <w:shd w:fill="F8FBFF" w:color="auto" w:val="clear"/>
+          </w:tcPr>
+          <w:p>
+            <w:r>
+              <w:rPr>
+                <w:rFonts w:ascii="Cambria" w:cs="Cambria" w:eastAsia="Cambria" w:hAnsi="Cambria"/>
+                <w:sz w:val="20"/>
+                <w:szCs w:val="20"/>
+              </w:rPr>
+              <w:t xml:space="preserve">Foundation Plan™</w:t>
             </w:r>
           </w:p>
         </w:tc>
@@ -3459,7 +3459,7 @@
                 <w:sz w:val="20"/>
                 <w:szCs w:val="20"/>
               </w:rPr>
-              <w:t xml:space="preserve">CRM Lite</w:t>
+              <w:t xml:space="preserve">Growth Plan™</w:t>
             </w:r>
           </w:p>
         </w:tc>
@@ -3505,121 +3505,121 @@
                 <w:sz w:val="20"/>
                 <w:szCs w:val="20"/>
               </w:rPr>
-              <w:t xml:space="preserve">CRM Premium</w:t>
-            </w:r>
-          </w:p>
-        </w:tc>
-        <w:tc>
-          <w:tcPr>
-            <w:tcW w:type="dxa" w:w="4680"/>
-            <w:tcBorders>
-              <w:top w:val="none" w:color="FFFFFF" w:sz="0"/>
-              <w:left w:val="none" w:color="FFFFFF" w:sz="0"/>
-              <w:bottom w:val="none" w:color="FFFFFF" w:sz="0"/>
-              <w:right w:val="none" w:color="FFFFFF" w:sz="0"/>
-            </w:tcBorders>
-            <w:shd w:fill="F8FBFF" w:color="auto" w:val="clear"/>
-          </w:tcPr>
-          <w:p>
-            <w:r>
-              <w:rPr>
-                <w:rFonts w:ascii="Cambria" w:cs="Cambria" w:eastAsia="Cambria" w:hAnsi="Cambria"/>
-                <w:sz w:val="20"/>
-                <w:szCs w:val="20"/>
-              </w:rPr>
-              <w:t xml:space="preserve">$299 onboarding + $179/month (or $1,990/year)</w:t>
-            </w:r>
-          </w:p>
-        </w:tc>
-      </w:tr>
-      <w:tr>
-        <w:tc>
-          <w:tcPr>
-            <w:tcW w:type="dxa" w:w="4680"/>
-            <w:tcBorders>
-              <w:top w:val="none" w:color="FFFFFF" w:sz="0"/>
-              <w:left w:val="none" w:color="FFFFFF" w:sz="0"/>
-              <w:bottom w:val="none" w:color="FFFFFF" w:sz="0"/>
-              <w:right w:val="none" w:color="FFFFFF" w:sz="0"/>
-            </w:tcBorders>
-            <w:shd w:fill="FFFFFF" w:color="auto" w:val="clear"/>
-          </w:tcPr>
-          <w:p>
-            <w:r>
-              <w:rPr>
-                <w:rFonts w:ascii="Cambria" w:cs="Cambria" w:eastAsia="Cambria" w:hAnsi="Cambria"/>
-                <w:sz w:val="20"/>
-                <w:szCs w:val="20"/>
-              </w:rPr>
-              <w:t xml:space="preserve">CRM Enterprise</w:t>
-            </w:r>
-          </w:p>
-        </w:tc>
-        <w:tc>
-          <w:tcPr>
-            <w:tcW w:type="dxa" w:w="4680"/>
-            <w:tcBorders>
-              <w:top w:val="none" w:color="FFFFFF" w:sz="0"/>
-              <w:left w:val="none" w:color="FFFFFF" w:sz="0"/>
-              <w:bottom w:val="none" w:color="FFFFFF" w:sz="0"/>
-              <w:right w:val="none" w:color="FFFFFF" w:sz="0"/>
-            </w:tcBorders>
-            <w:shd w:fill="FFFFFF" w:color="auto" w:val="clear"/>
-          </w:tcPr>
-          <w:p>
-            <w:r>
-              <w:rPr>
-                <w:rFonts w:ascii="Cambria" w:cs="Cambria" w:eastAsia="Cambria" w:hAnsi="Cambria"/>
-                <w:sz w:val="20"/>
-                <w:szCs w:val="20"/>
-              </w:rPr>
-              <w:t xml:space="preserve">$799 white-glove onboarding + $499/month</w:t>
-            </w:r>
-          </w:p>
-        </w:tc>
-      </w:tr>
-      <w:tr>
-        <w:tc>
-          <w:tcPr>
-            <w:tcW w:type="dxa" w:w="4680"/>
-            <w:tcBorders>
-              <w:top w:val="none" w:color="FFFFFF" w:sz="0"/>
-              <w:left w:val="none" w:color="FFFFFF" w:sz="0"/>
-              <w:bottom w:val="none" w:color="FFFFFF" w:sz="0"/>
-              <w:right w:val="none" w:color="FFFFFF" w:sz="0"/>
-            </w:tcBorders>
-            <w:shd w:fill="F8FBFF" w:color="auto" w:val="clear"/>
-          </w:tcPr>
-          <w:p>
-            <w:r>
-              <w:rPr>
-                <w:rFonts w:ascii="Cambria" w:cs="Cambria" w:eastAsia="Cambria" w:hAnsi="Cambria"/>
-                <w:sz w:val="20"/>
-                <w:szCs w:val="20"/>
-              </w:rPr>
-              <w:t xml:space="preserve">White-Label CRM</w:t>
-            </w:r>
-          </w:p>
-        </w:tc>
-        <w:tc>
-          <w:tcPr>
-            <w:tcW w:type="dxa" w:w="4680"/>
-            <w:tcBorders>
-              <w:top w:val="none" w:color="FFFFFF" w:sz="0"/>
-              <w:left w:val="none" w:color="FFFFFF" w:sz="0"/>
-              <w:bottom w:val="none" w:color="FFFFFF" w:sz="0"/>
-              <w:right w:val="none" w:color="FFFFFF" w:sz="0"/>
-            </w:tcBorders>
-            <w:shd w:fill="F8FBFF" w:color="auto" w:val="clear"/>
-          </w:tcPr>
-          <w:p>
-            <w:r>
-              <w:rPr>
-                <w:rFonts w:ascii="Cambria" w:cs="Cambria" w:eastAsia="Cambria" w:hAnsi="Cambria"/>
-                <w:sz w:val="20"/>
-                <w:szCs w:val="20"/>
-              </w:rPr>
-              <w:t xml:space="preserve">$499 onboarding + $697/month (annual contract)</w:t>
+              <w:t xml:space="preserve">Founder Plan™</w:t>
+            </w:r>
+          </w:p>
+        </w:tc>
+        <w:tc>
+          <w:tcPr>
+            <w:tcW w:type="dxa" w:w="4680"/>
+            <w:tcBorders>
+              <w:top w:val="none" w:color="FFFFFF" w:sz="0"/>
+              <w:left w:val="none" w:color="FFFFFF" w:sz="0"/>
+              <w:bottom w:val="none" w:color="FFFFFF" w:sz="0"/>
+              <w:right w:val="none" w:color="FFFFFF" w:sz="0"/>
+            </w:tcBorders>
+            <w:shd w:fill="F8FBFF" w:color="auto" w:val="clear"/>
+          </w:tcPr>
+          <w:p>
+            <w:r>
+              <w:rPr>
+                <w:rFonts w:ascii="Cambria" w:cs="Cambria" w:eastAsia="Cambria" w:hAnsi="Cambria"/>
+                <w:sz w:val="20"/>
+                <w:szCs w:val="20"/>
+              </w:rPr>
+              <w:t xml:space="preserve">$299 onboarding + $199/month (or $1,990/year)</w:t>
+            </w:r>
+          </w:p>
+        </w:tc>
+      </w:tr>
+      <w:tr>
+        <w:tc>
+          <w:tcPr>
+            <w:tcW w:type="dxa" w:w="4680"/>
+            <w:tcBorders>
+              <w:top w:val="none" w:color="FFFFFF" w:sz="0"/>
+              <w:left w:val="none" w:color="FFFFFF" w:sz="0"/>
+              <w:bottom w:val="none" w:color="FFFFFF" w:sz="0"/>
+              <w:right w:val="none" w:color="FFFFFF" w:sz="0"/>
+            </w:tcBorders>
+            <w:shd w:fill="FFFFFF" w:color="auto" w:val="clear"/>
+          </w:tcPr>
+          <w:p>
+            <w:r>
+              <w:rPr>
+                <w:rFonts w:ascii="Cambria" w:cs="Cambria" w:eastAsia="Cambria" w:hAnsi="Cambria"/>
+                <w:sz w:val="20"/>
+                <w:szCs w:val="20"/>
+              </w:rPr>
+              <w:t xml:space="preserve">Enterprise Plan™</w:t>
+            </w:r>
+          </w:p>
+        </w:tc>
+        <w:tc>
+          <w:tcPr>
+            <w:tcW w:type="dxa" w:w="4680"/>
+            <w:tcBorders>
+              <w:top w:val="none" w:color="FFFFFF" w:sz="0"/>
+              <w:left w:val="none" w:color="FFFFFF" w:sz="0"/>
+              <w:bottom w:val="none" w:color="FFFFFF" w:sz="0"/>
+              <w:right w:val="none" w:color="FFFFFF" w:sz="0"/>
+            </w:tcBorders>
+            <w:shd w:fill="FFFFFF" w:color="auto" w:val="clear"/>
+          </w:tcPr>
+          <w:p>
+            <w:r>
+              <w:rPr>
+                <w:rFonts w:ascii="Cambria" w:cs="Cambria" w:eastAsia="Cambria" w:hAnsi="Cambria"/>
+                <w:sz w:val="20"/>
+                <w:szCs w:val="20"/>
+              </w:rPr>
+              <w:t xml:space="preserve">$799 white-glove onboarding + $399/month</w:t>
+            </w:r>
+          </w:p>
+        </w:tc>
+      </w:tr>
+      <w:tr>
+        <w:tc>
+          <w:tcPr>
+            <w:tcW w:type="dxa" w:w="4680"/>
+            <w:tcBorders>
+              <w:top w:val="none" w:color="FFFFFF" w:sz="0"/>
+              <w:left w:val="none" w:color="FFFFFF" w:sz="0"/>
+              <w:bottom w:val="none" w:color="FFFFFF" w:sz="0"/>
+              <w:right w:val="none" w:color="FFFFFF" w:sz="0"/>
+            </w:tcBorders>
+            <w:shd w:fill="F8FBFF" w:color="auto" w:val="clear"/>
+          </w:tcPr>
+          <w:p>
+            <w:r>
+              <w:rPr>
+                <w:rFonts w:ascii="Cambria" w:cs="Cambria" w:eastAsia="Cambria" w:hAnsi="Cambria"/>
+                <w:sz w:val="20"/>
+                <w:szCs w:val="20"/>
+              </w:rPr>
+              <w:t xml:space="preserve">Agency Edition™</w:t>
+            </w:r>
+          </w:p>
+        </w:tc>
+        <w:tc>
+          <w:tcPr>
+            <w:tcW w:type="dxa" w:w="4680"/>
+            <w:tcBorders>
+              <w:top w:val="none" w:color="FFFFFF" w:sz="0"/>
+              <w:left w:val="none" w:color="FFFFFF" w:sz="0"/>
+              <w:bottom w:val="none" w:color="FFFFFF" w:sz="0"/>
+              <w:right w:val="none" w:color="FFFFFF" w:sz="0"/>
+            </w:tcBorders>
+            <w:shd w:fill="F8FBFF" w:color="auto" w:val="clear"/>
+          </w:tcPr>
+          <w:p>
+            <w:r>
+              <w:rPr>
+                <w:rFonts w:ascii="Cambria" w:cs="Cambria" w:eastAsia="Cambria" w:hAnsi="Cambria"/>
+                <w:sz w:val="20"/>
+                <w:szCs w:val="20"/>
+              </w:rPr>
+              <w:t xml:space="preserve">$499 onboarding + $899/month (annual contract)</w:t>
             </w:r>
           </w:p>
         </w:tc>
@@ -3813,7 +3813,7 @@
           <w:sz w:val="24"/>
           <w:szCs w:val="24"/>
         </w:rPr>
-        <w:t xml:space="preserve">Every BluWav Growth System includes a 14-day free trial of CRM Premium. After the trial, clients choose their CRM plan.</w:t>
+        <w:t xml:space="preserve">Every BluWav Growth System includes a 14-day free trial of Founder Plan™. After the trial, clients choose their CRM plan.</w:t>
       </w:r>
     </w:p>
     <w:p>
@@ -3895,7 +3895,7 @@
                 <w:sz w:val="20"/>
                 <w:szCs w:val="20"/>
               </w:rPr>
-              <w:t xml:space="preserve">Ripple (Starter)</w:t>
+              <w:t xml:space="preserve">Launch™ (Starter)</w:t>
             </w:r>
           </w:p>
         </w:tc>
@@ -3920,7 +3920,7 @@
                 <w:sz w:val="20"/>
                 <w:szCs w:val="20"/>
               </w:rPr>
-              <w:t xml:space="preserve">Current (Growth)</w:t>
+              <w:t xml:space="preserve">Momentum™ (Growth)</w:t>
             </w:r>
           </w:p>
         </w:tc>
@@ -3945,7 +3945,7 @@
                 <w:sz w:val="20"/>
                 <w:szCs w:val="20"/>
               </w:rPr>
-              <w:t xml:space="preserve">Surge (Full)</w:t>
+              <w:t xml:space="preserve">Accelerate™ (Full)</w:t>
             </w:r>
           </w:p>
         </w:tc>
@@ -3991,51 +3991,51 @@
                 <w:sz w:val="20"/>
                 <w:szCs w:val="20"/>
               </w:rPr>
-              <w:t xml:space="preserve">$1,800+</w:t>
-            </w:r>
-          </w:p>
-        </w:tc>
-        <w:tc>
-          <w:tcPr>
-            <w:tcW w:type="dxa" w:w="2340"/>
-            <w:tcBorders>
-              <w:top w:val="none" w:color="FFFFFF" w:sz="0"/>
-              <w:left w:val="none" w:color="FFFFFF" w:sz="0"/>
-              <w:bottom w:val="none" w:color="FFFFFF" w:sz="0"/>
-              <w:right w:val="none" w:color="FFFFFF" w:sz="0"/>
-            </w:tcBorders>
-            <w:shd w:fill="FFFFFF" w:color="auto" w:val="clear"/>
-          </w:tcPr>
-          <w:p>
-            <w:r>
-              <w:rPr>
-                <w:rFonts w:ascii="Cambria" w:cs="Cambria" w:eastAsia="Cambria" w:hAnsi="Cambria"/>
-                <w:sz w:val="20"/>
-                <w:szCs w:val="20"/>
-              </w:rPr>
-              <w:t xml:space="preserve">$3,000+</w:t>
-            </w:r>
-          </w:p>
-        </w:tc>
-        <w:tc>
-          <w:tcPr>
-            <w:tcW w:type="dxa" w:w="2340"/>
-            <w:tcBorders>
-              <w:top w:val="none" w:color="FFFFFF" w:sz="0"/>
-              <w:left w:val="none" w:color="FFFFFF" w:sz="0"/>
-              <w:bottom w:val="none" w:color="FFFFFF" w:sz="0"/>
-              <w:right w:val="none" w:color="FFFFFF" w:sz="0"/>
-            </w:tcBorders>
-            <w:shd w:fill="FFFFFF" w:color="auto" w:val="clear"/>
-          </w:tcPr>
-          <w:p>
-            <w:r>
-              <w:rPr>
-                <w:rFonts w:ascii="Cambria" w:cs="Cambria" w:eastAsia="Cambria" w:hAnsi="Cambria"/>
-                <w:sz w:val="20"/>
-                <w:szCs w:val="20"/>
-              </w:rPr>
-              <w:t xml:space="preserve">$5,000+</w:t>
+              <w:t xml:space="preserve">$397/mo + $900 setup</w:t>
+            </w:r>
+          </w:p>
+        </w:tc>
+        <w:tc>
+          <w:tcPr>
+            <w:tcW w:type="dxa" w:w="2340"/>
+            <w:tcBorders>
+              <w:top w:val="none" w:color="FFFFFF" w:sz="0"/>
+              <w:left w:val="none" w:color="FFFFFF" w:sz="0"/>
+              <w:bottom w:val="none" w:color="FFFFFF" w:sz="0"/>
+              <w:right w:val="none" w:color="FFFFFF" w:sz="0"/>
+            </w:tcBorders>
+            <w:shd w:fill="FFFFFF" w:color="auto" w:val="clear"/>
+          </w:tcPr>
+          <w:p>
+            <w:r>
+              <w:rPr>
+                <w:rFonts w:ascii="Cambria" w:cs="Cambria" w:eastAsia="Cambria" w:hAnsi="Cambria"/>
+                <w:sz w:val="20"/>
+                <w:szCs w:val="20"/>
+              </w:rPr>
+              <w:t xml:space="preserve">$697/mo + $1,250 setup</w:t>
+            </w:r>
+          </w:p>
+        </w:tc>
+        <w:tc>
+          <w:tcPr>
+            <w:tcW w:type="dxa" w:w="2340"/>
+            <w:tcBorders>
+              <w:top w:val="none" w:color="FFFFFF" w:sz="0"/>
+              <w:left w:val="none" w:color="FFFFFF" w:sz="0"/>
+              <w:bottom w:val="none" w:color="FFFFFF" w:sz="0"/>
+              <w:right w:val="none" w:color="FFFFFF" w:sz="0"/>
+            </w:tcBorders>
+            <w:shd w:fill="FFFFFF" w:color="auto" w:val="clear"/>
+          </w:tcPr>
+          <w:p>
+            <w:r>
+              <w:rPr>
+                <w:rFonts w:ascii="Cambria" w:cs="Cambria" w:eastAsia="Cambria" w:hAnsi="Cambria"/>
+                <w:sz w:val="20"/>
+                <w:szCs w:val="20"/>
+              </w:rPr>
+              <w:t xml:space="preserve">$1,497/mo + $2,500 setup</w:t>
             </w:r>
           </w:p>
         </w:tc>
@@ -4239,7 +4239,7 @@
                 <w:sz w:val="20"/>
                 <w:szCs w:val="20"/>
               </w:rPr>
-              <w:t xml:space="preserve">14-day CRM Premium trial</w:t>
+              <w:t xml:space="preserve">14-day Founder Plan™ trial</w:t>
             </w:r>
           </w:p>
         </w:tc>
@@ -6560,7 +6560,7 @@
         <w:pStyle w:val="Heading2"/>
       </w:pPr>
       <w:r>
-        <w:t xml:space="preserve">CRM Starter — $59/month</w:t>
+        <w:t xml:space="preserve">Foundation Plan™ — $59/month</w:t>
       </w:r>
     </w:p>
     <w:p>
@@ -7121,7 +7121,7 @@
         <w:pStyle w:val="Heading2"/>
       </w:pPr>
       <w:r>
-        <w:t xml:space="preserve">CRM Lite — $99/month</w:t>
+        <w:t xml:space="preserve">Growth Plan™ — $99/month</w:t>
       </w:r>
     </w:p>
     <w:p>
@@ -7230,7 +7230,7 @@
                 <w:sz w:val="20"/>
                 <w:szCs w:val="20"/>
               </w:rPr>
-              <w:t xml:space="preserve">Everything in CRM Starter</w:t>
+              <w:t xml:space="preserve">Everything in Foundation Plan™</w:t>
             </w:r>
           </w:p>
         </w:tc>
@@ -7544,7 +7544,7 @@
         <w:pStyle w:val="Heading2"/>
       </w:pPr>
       <w:r>
-        <w:t xml:space="preserve">CRM Premium — $179/month (Introductory Rate)</w:t>
+        <w:t xml:space="preserve">Founder Plan™ — $199/month (Introductory Rate)</w:t>
       </w:r>
     </w:p>
     <w:p>
@@ -7653,7 +7653,7 @@
                 <w:sz w:val="20"/>
                 <w:szCs w:val="20"/>
               </w:rPr>
-              <w:t xml:space="preserve">Everything in CRM Lite</w:t>
+              <w:t xml:space="preserve">Everything in Growth Plan™</w:t>
             </w:r>
           </w:p>
         </w:tc>
@@ -8207,7 +8207,7 @@
         <w:pStyle w:val="Heading2"/>
       </w:pPr>
       <w:r>
-        <w:t xml:space="preserve">CRM Enterprise — $499/month</w:t>
+        <w:t xml:space="preserve">Enterprise Plan™ — $399/month</w:t>
       </w:r>
     </w:p>
     <w:p>
@@ -8316,7 +8316,7 @@
                 <w:sz w:val="20"/>
                 <w:szCs w:val="20"/>
               </w:rPr>
-              <w:t xml:space="preserve">Everything in CRM Premium</w:t>
+              <w:t xml:space="preserve">Everything in Founder Plan™</w:t>
             </w:r>
           </w:p>
         </w:tc>
@@ -8814,7 +8814,7 @@
         <w:pStyle w:val="Heading2"/>
       </w:pPr>
       <w:r>
-        <w:t xml:space="preserve">White-Label CRM — $697/month</w:t>
+        <w:t xml:space="preserve">Agency Edition™ — $899/month</w:t>
       </w:r>
     </w:p>
     <w:p>
@@ -9687,7 +9687,7 @@
           <w:sz w:val="24"/>
           <w:szCs w:val="24"/>
         </w:rPr>
-        <w:t xml:space="preserve">Enterprise &amp; White-Label: Global agencies and consultants</w:t>
+        <w:t xml:space="preserve">Enterprise &amp; Agency Edition™: Global agencies and consultants</w:t>
       </w:r>
     </w:p>
     <w:p>
@@ -11642,7 +11642,7 @@
         <w:pStyle w:val="Heading2"/>
       </w:pPr>
       <w:r>
-        <w:t xml:space="preserve">Current Metrics (July 2026)</w:t>
+        <w:t xml:space="preserve">Momentum™ Metrics (July 2026)</w:t>
       </w:r>
     </w:p>
     <w:tbl>
@@ -12248,7 +12248,7 @@
                 <w:sz w:val="20"/>
                 <w:szCs w:val="20"/>
               </w:rPr>
-              <w:t xml:space="preserve">CRM Premium conversions</w:t>
+              <w:t xml:space="preserve">Founder Plan™ conversions</w:t>
             </w:r>
           </w:p>
         </w:tc>
@@ -12316,7 +12316,7 @@
                 <w:sz w:val="20"/>
                 <w:szCs w:val="20"/>
               </w:rPr>
-              <w:t xml:space="preserve">CRM Enterprise clients</w:t>
+              <w:t xml:space="preserve">Enterprise Plan™ clients</w:t>
             </w:r>
           </w:p>
         </w:tc>
@@ -12384,7 +12384,7 @@
                 <w:sz w:val="20"/>
                 <w:szCs w:val="20"/>
               </w:rPr>
-              <w:t xml:space="preserve">White-Label partners</w:t>
+              <w:t xml:space="preserve">Agency Edition™ partners</w:t>
             </w:r>
           </w:p>
         </w:tc>
@@ -12866,7 +12866,7 @@
           <w:sz w:val="24"/>
           <w:szCs w:val="24"/>
         </w:rPr>
-        <w:t xml:space="preserve">CRM Premium is a promise to keep getting better every month.</w:t>
+        <w:t xml:space="preserve">Founder Plan™ is a promise to keep getting better every month.</w:t>
       </w:r>
     </w:p>
     <w:p>
@@ -13540,277 +13540,277 @@
                 <w:sz w:val="20"/>
                 <w:szCs w:val="20"/>
               </w:rPr>
-              <w:t xml:space="preserve">Ripple setup ($1,800)</w:t>
-            </w:r>
-          </w:p>
-        </w:tc>
-        <w:tc>
-          <w:tcPr>
-            <w:tcW w:type="dxa" w:w="2340"/>
-            <w:tcBorders>
-              <w:top w:val="none" w:color="FFFFFF" w:sz="0"/>
-              <w:left w:val="none" w:color="FFFFFF" w:sz="0"/>
-              <w:bottom w:val="none" w:color="FFFFFF" w:sz="0"/>
-              <w:right w:val="none" w:color="FFFFFF" w:sz="0"/>
-            </w:tcBorders>
-            <w:shd w:fill="FFFFFF" w:color="auto" w:val="clear"/>
-          </w:tcPr>
-          <w:p>
-            <w:r>
-              <w:rPr>
-                <w:rFonts w:ascii="Cambria" w:cs="Cambria" w:eastAsia="Cambria" w:hAnsi="Cambria"/>
-                <w:sz w:val="20"/>
-                <w:szCs w:val="20"/>
-              </w:rPr>
-              <w:t xml:space="preserve">$180</w:t>
-            </w:r>
-          </w:p>
-        </w:tc>
-        <w:tc>
-          <w:tcPr>
-            <w:tcW w:type="dxa" w:w="2340"/>
-            <w:tcBorders>
-              <w:top w:val="none" w:color="FFFFFF" w:sz="0"/>
-              <w:left w:val="none" w:color="FFFFFF" w:sz="0"/>
-              <w:bottom w:val="none" w:color="FFFFFF" w:sz="0"/>
-              <w:right w:val="none" w:color="FFFFFF" w:sz="0"/>
-            </w:tcBorders>
-            <w:shd w:fill="FFFFFF" w:color="auto" w:val="clear"/>
-          </w:tcPr>
-          <w:p>
-            <w:r>
-              <w:rPr>
-                <w:rFonts w:ascii="Cambria" w:cs="Cambria" w:eastAsia="Cambria" w:hAnsi="Cambria"/>
-                <w:sz w:val="20"/>
-                <w:szCs w:val="20"/>
-              </w:rPr>
-              <w:t xml:space="preserve">$270</w:t>
-            </w:r>
-          </w:p>
-        </w:tc>
-        <w:tc>
-          <w:tcPr>
-            <w:tcW w:type="dxa" w:w="2340"/>
-            <w:tcBorders>
-              <w:top w:val="none" w:color="FFFFFF" w:sz="0"/>
-              <w:left w:val="none" w:color="FFFFFF" w:sz="0"/>
-              <w:bottom w:val="none" w:color="FFFFFF" w:sz="0"/>
-              <w:right w:val="none" w:color="FFFFFF" w:sz="0"/>
-            </w:tcBorders>
-            <w:shd w:fill="FFFFFF" w:color="auto" w:val="clear"/>
-          </w:tcPr>
-          <w:p>
-            <w:r>
-              <w:rPr>
-                <w:rFonts w:ascii="Cambria" w:cs="Cambria" w:eastAsia="Cambria" w:hAnsi="Cambria"/>
-                <w:sz w:val="20"/>
-                <w:szCs w:val="20"/>
-              </w:rPr>
-              <w:t xml:space="preserve">$360</w:t>
-            </w:r>
-          </w:p>
-        </w:tc>
-      </w:tr>
-      <w:tr>
-        <w:tc>
-          <w:tcPr>
-            <w:tcW w:type="dxa" w:w="2340"/>
-            <w:tcBorders>
-              <w:top w:val="none" w:color="FFFFFF" w:sz="0"/>
-              <w:left w:val="none" w:color="FFFFFF" w:sz="0"/>
-              <w:bottom w:val="none" w:color="FFFFFF" w:sz="0"/>
-              <w:right w:val="none" w:color="FFFFFF" w:sz="0"/>
-            </w:tcBorders>
-            <w:shd w:fill="F8FBFF" w:color="auto" w:val="clear"/>
-          </w:tcPr>
-          <w:p>
-            <w:r>
-              <w:rPr>
-                <w:rFonts w:ascii="Cambria" w:cs="Cambria" w:eastAsia="Cambria" w:hAnsi="Cambria"/>
-                <w:sz w:val="20"/>
-                <w:szCs w:val="20"/>
-              </w:rPr>
-              <w:t xml:space="preserve">Current setup ($3,000)</w:t>
-            </w:r>
-          </w:p>
-        </w:tc>
-        <w:tc>
-          <w:tcPr>
-            <w:tcW w:type="dxa" w:w="2340"/>
-            <w:tcBorders>
-              <w:top w:val="none" w:color="FFFFFF" w:sz="0"/>
-              <w:left w:val="none" w:color="FFFFFF" w:sz="0"/>
-              <w:bottom w:val="none" w:color="FFFFFF" w:sz="0"/>
-              <w:right w:val="none" w:color="FFFFFF" w:sz="0"/>
-            </w:tcBorders>
-            <w:shd w:fill="F8FBFF" w:color="auto" w:val="clear"/>
-          </w:tcPr>
-          <w:p>
-            <w:r>
-              <w:rPr>
-                <w:rFonts w:ascii="Cambria" w:cs="Cambria" w:eastAsia="Cambria" w:hAnsi="Cambria"/>
-                <w:sz w:val="20"/>
-                <w:szCs w:val="20"/>
-              </w:rPr>
-              <w:t xml:space="preserve">$300</w:t>
-            </w:r>
-          </w:p>
-        </w:tc>
-        <w:tc>
-          <w:tcPr>
-            <w:tcW w:type="dxa" w:w="2340"/>
-            <w:tcBorders>
-              <w:top w:val="none" w:color="FFFFFF" w:sz="0"/>
-              <w:left w:val="none" w:color="FFFFFF" w:sz="0"/>
-              <w:bottom w:val="none" w:color="FFFFFF" w:sz="0"/>
-              <w:right w:val="none" w:color="FFFFFF" w:sz="0"/>
-            </w:tcBorders>
-            <w:shd w:fill="F8FBFF" w:color="auto" w:val="clear"/>
-          </w:tcPr>
-          <w:p>
-            <w:r>
-              <w:rPr>
-                <w:rFonts w:ascii="Cambria" w:cs="Cambria" w:eastAsia="Cambria" w:hAnsi="Cambria"/>
-                <w:sz w:val="20"/>
-                <w:szCs w:val="20"/>
-              </w:rPr>
-              <w:t xml:space="preserve">$450</w:t>
-            </w:r>
-          </w:p>
-        </w:tc>
-        <w:tc>
-          <w:tcPr>
-            <w:tcW w:type="dxa" w:w="2340"/>
-            <w:tcBorders>
-              <w:top w:val="none" w:color="FFFFFF" w:sz="0"/>
-              <w:left w:val="none" w:color="FFFFFF" w:sz="0"/>
-              <w:bottom w:val="none" w:color="FFFFFF" w:sz="0"/>
-              <w:right w:val="none" w:color="FFFFFF" w:sz="0"/>
-            </w:tcBorders>
-            <w:shd w:fill="F8FBFF" w:color="auto" w:val="clear"/>
-          </w:tcPr>
-          <w:p>
-            <w:r>
-              <w:rPr>
-                <w:rFonts w:ascii="Cambria" w:cs="Cambria" w:eastAsia="Cambria" w:hAnsi="Cambria"/>
-                <w:sz w:val="20"/>
-                <w:szCs w:val="20"/>
-              </w:rPr>
-              <w:t xml:space="preserve">$600</w:t>
-            </w:r>
-          </w:p>
-        </w:tc>
-      </w:tr>
-      <w:tr>
-        <w:tc>
-          <w:tcPr>
-            <w:tcW w:type="dxa" w:w="2340"/>
-            <w:tcBorders>
-              <w:top w:val="none" w:color="FFFFFF" w:sz="0"/>
-              <w:left w:val="none" w:color="FFFFFF" w:sz="0"/>
-              <w:bottom w:val="none" w:color="FFFFFF" w:sz="0"/>
-              <w:right w:val="none" w:color="FFFFFF" w:sz="0"/>
-            </w:tcBorders>
-            <w:shd w:fill="FFFFFF" w:color="auto" w:val="clear"/>
-          </w:tcPr>
-          <w:p>
-            <w:r>
-              <w:rPr>
-                <w:rFonts w:ascii="Cambria" w:cs="Cambria" w:eastAsia="Cambria" w:hAnsi="Cambria"/>
-                <w:sz w:val="20"/>
-                <w:szCs w:val="20"/>
-              </w:rPr>
-              <w:t xml:space="preserve">Surge setup ($5,000)</w:t>
-            </w:r>
-          </w:p>
-        </w:tc>
-        <w:tc>
-          <w:tcPr>
-            <w:tcW w:type="dxa" w:w="2340"/>
-            <w:tcBorders>
-              <w:top w:val="none" w:color="FFFFFF" w:sz="0"/>
-              <w:left w:val="none" w:color="FFFFFF" w:sz="0"/>
-              <w:bottom w:val="none" w:color="FFFFFF" w:sz="0"/>
-              <w:right w:val="none" w:color="FFFFFF" w:sz="0"/>
-            </w:tcBorders>
-            <w:shd w:fill="FFFFFF" w:color="auto" w:val="clear"/>
-          </w:tcPr>
-          <w:p>
-            <w:r>
-              <w:rPr>
-                <w:rFonts w:ascii="Cambria" w:cs="Cambria" w:eastAsia="Cambria" w:hAnsi="Cambria"/>
-                <w:sz w:val="20"/>
-                <w:szCs w:val="20"/>
-              </w:rPr>
-              <w:t xml:space="preserve">$500</w:t>
-            </w:r>
-          </w:p>
-        </w:tc>
-        <w:tc>
-          <w:tcPr>
-            <w:tcW w:type="dxa" w:w="2340"/>
-            <w:tcBorders>
-              <w:top w:val="none" w:color="FFFFFF" w:sz="0"/>
-              <w:left w:val="none" w:color="FFFFFF" w:sz="0"/>
-              <w:bottom w:val="none" w:color="FFFFFF" w:sz="0"/>
-              <w:right w:val="none" w:color="FFFFFF" w:sz="0"/>
-            </w:tcBorders>
-            <w:shd w:fill="FFFFFF" w:color="auto" w:val="clear"/>
-          </w:tcPr>
-          <w:p>
-            <w:r>
-              <w:rPr>
-                <w:rFonts w:ascii="Cambria" w:cs="Cambria" w:eastAsia="Cambria" w:hAnsi="Cambria"/>
-                <w:sz w:val="20"/>
-                <w:szCs w:val="20"/>
-              </w:rPr>
-              <w:t xml:space="preserve">$750</w:t>
-            </w:r>
-          </w:p>
-        </w:tc>
-        <w:tc>
-          <w:tcPr>
-            <w:tcW w:type="dxa" w:w="2340"/>
-            <w:tcBorders>
-              <w:top w:val="none" w:color="FFFFFF" w:sz="0"/>
-              <w:left w:val="none" w:color="FFFFFF" w:sz="0"/>
-              <w:bottom w:val="none" w:color="FFFFFF" w:sz="0"/>
-              <w:right w:val="none" w:color="FFFFFF" w:sz="0"/>
-            </w:tcBorders>
-            <w:shd w:fill="FFFFFF" w:color="auto" w:val="clear"/>
-          </w:tcPr>
-          <w:p>
-            <w:r>
-              <w:rPr>
-                <w:rFonts w:ascii="Cambria" w:cs="Cambria" w:eastAsia="Cambria" w:hAnsi="Cambria"/>
-                <w:sz w:val="20"/>
-                <w:szCs w:val="20"/>
-              </w:rPr>
-              <w:t xml:space="preserve">$1,000</w:t>
-            </w:r>
-          </w:p>
-        </w:tc>
-      </w:tr>
-      <w:tr>
-        <w:tc>
-          <w:tcPr>
-            <w:tcW w:type="dxa" w:w="2340"/>
-            <w:tcBorders>
-              <w:top w:val="none" w:color="FFFFFF" w:sz="0"/>
-              <w:left w:val="none" w:color="FFFFFF" w:sz="0"/>
-              <w:bottom w:val="none" w:color="FFFFFF" w:sz="0"/>
-              <w:right w:val="none" w:color="FFFFFF" w:sz="0"/>
-            </w:tcBorders>
-            <w:shd w:fill="F8FBFF" w:color="auto" w:val="clear"/>
-          </w:tcPr>
-          <w:p>
-            <w:r>
-              <w:rPr>
-                <w:rFonts w:ascii="Cambria" w:cs="Cambria" w:eastAsia="Cambria" w:hAnsi="Cambria"/>
-                <w:sz w:val="20"/>
-                <w:szCs w:val="20"/>
-              </w:rPr>
-              <w:t xml:space="preserve">CRM Starter /month ($59)</w:t>
+              <w:t xml:space="preserve">Launch™ ($397/mo)</w:t>
+            </w:r>
+          </w:p>
+        </w:tc>
+        <w:tc>
+          <w:tcPr>
+            <w:tcW w:type="dxa" w:w="2340"/>
+            <w:tcBorders>
+              <w:top w:val="none" w:color="FFFFFF" w:sz="0"/>
+              <w:left w:val="none" w:color="FFFFFF" w:sz="0"/>
+              <w:bottom w:val="none" w:color="FFFFFF" w:sz="0"/>
+              <w:right w:val="none" w:color="FFFFFF" w:sz="0"/>
+            </w:tcBorders>
+            <w:shd w:fill="FFFFFF" w:color="auto" w:val="clear"/>
+          </w:tcPr>
+          <w:p>
+            <w:r>
+              <w:rPr>
+                <w:rFonts w:ascii="Cambria" w:cs="Cambria" w:eastAsia="Cambria" w:hAnsi="Cambria"/>
+                <w:sz w:val="20"/>
+                <w:szCs w:val="20"/>
+              </w:rPr>
+              <w:t xml:space="preserve">$79.40/mo</w:t>
+            </w:r>
+          </w:p>
+        </w:tc>
+        <w:tc>
+          <w:tcPr>
+            <w:tcW w:type="dxa" w:w="2340"/>
+            <w:tcBorders>
+              <w:top w:val="none" w:color="FFFFFF" w:sz="0"/>
+              <w:left w:val="none" w:color="FFFFFF" w:sz="0"/>
+              <w:bottom w:val="none" w:color="FFFFFF" w:sz="0"/>
+              <w:right w:val="none" w:color="FFFFFF" w:sz="0"/>
+            </w:tcBorders>
+            <w:shd w:fill="FFFFFF" w:color="auto" w:val="clear"/>
+          </w:tcPr>
+          <w:p>
+            <w:r>
+              <w:rPr>
+                <w:rFonts w:ascii="Cambria" w:cs="Cambria" w:eastAsia="Cambria" w:hAnsi="Cambria"/>
+                <w:sz w:val="20"/>
+                <w:szCs w:val="20"/>
+              </w:rPr>
+              <w:t xml:space="preserve">$119.10/mo</w:t>
+            </w:r>
+          </w:p>
+        </w:tc>
+        <w:tc>
+          <w:tcPr>
+            <w:tcW w:type="dxa" w:w="2340"/>
+            <w:tcBorders>
+              <w:top w:val="none" w:color="FFFFFF" w:sz="0"/>
+              <w:left w:val="none" w:color="FFFFFF" w:sz="0"/>
+              <w:bottom w:val="none" w:color="FFFFFF" w:sz="0"/>
+              <w:right w:val="none" w:color="FFFFFF" w:sz="0"/>
+            </w:tcBorders>
+            <w:shd w:fill="FFFFFF" w:color="auto" w:val="clear"/>
+          </w:tcPr>
+          <w:p>
+            <w:r>
+              <w:rPr>
+                <w:rFonts w:ascii="Cambria" w:cs="Cambria" w:eastAsia="Cambria" w:hAnsi="Cambria"/>
+                <w:sz w:val="20"/>
+                <w:szCs w:val="20"/>
+              </w:rPr>
+              <w:t xml:space="preserve">$158.80/mo</w:t>
+            </w:r>
+          </w:p>
+        </w:tc>
+      </w:tr>
+      <w:tr>
+        <w:tc>
+          <w:tcPr>
+            <w:tcW w:type="dxa" w:w="2340"/>
+            <w:tcBorders>
+              <w:top w:val="none" w:color="FFFFFF" w:sz="0"/>
+              <w:left w:val="none" w:color="FFFFFF" w:sz="0"/>
+              <w:bottom w:val="none" w:color="FFFFFF" w:sz="0"/>
+              <w:right w:val="none" w:color="FFFFFF" w:sz="0"/>
+            </w:tcBorders>
+            <w:shd w:fill="F8FBFF" w:color="auto" w:val="clear"/>
+          </w:tcPr>
+          <w:p>
+            <w:r>
+              <w:rPr>
+                <w:rFonts w:ascii="Cambria" w:cs="Cambria" w:eastAsia="Cambria" w:hAnsi="Cambria"/>
+                <w:sz w:val="20"/>
+                <w:szCs w:val="20"/>
+              </w:rPr>
+              <w:t xml:space="preserve">Momentum™ ($697/mo)</w:t>
+            </w:r>
+          </w:p>
+        </w:tc>
+        <w:tc>
+          <w:tcPr>
+            <w:tcW w:type="dxa" w:w="2340"/>
+            <w:tcBorders>
+              <w:top w:val="none" w:color="FFFFFF" w:sz="0"/>
+              <w:left w:val="none" w:color="FFFFFF" w:sz="0"/>
+              <w:bottom w:val="none" w:color="FFFFFF" w:sz="0"/>
+              <w:right w:val="none" w:color="FFFFFF" w:sz="0"/>
+            </w:tcBorders>
+            <w:shd w:fill="F8FBFF" w:color="auto" w:val="clear"/>
+          </w:tcPr>
+          <w:p>
+            <w:r>
+              <w:rPr>
+                <w:rFonts w:ascii="Cambria" w:cs="Cambria" w:eastAsia="Cambria" w:hAnsi="Cambria"/>
+                <w:sz w:val="20"/>
+                <w:szCs w:val="20"/>
+              </w:rPr>
+              <w:t xml:space="preserve">$139.40/mo</w:t>
+            </w:r>
+          </w:p>
+        </w:tc>
+        <w:tc>
+          <w:tcPr>
+            <w:tcW w:type="dxa" w:w="2340"/>
+            <w:tcBorders>
+              <w:top w:val="none" w:color="FFFFFF" w:sz="0"/>
+              <w:left w:val="none" w:color="FFFFFF" w:sz="0"/>
+              <w:bottom w:val="none" w:color="FFFFFF" w:sz="0"/>
+              <w:right w:val="none" w:color="FFFFFF" w:sz="0"/>
+            </w:tcBorders>
+            <w:shd w:fill="F8FBFF" w:color="auto" w:val="clear"/>
+          </w:tcPr>
+          <w:p>
+            <w:r>
+              <w:rPr>
+                <w:rFonts w:ascii="Cambria" w:cs="Cambria" w:eastAsia="Cambria" w:hAnsi="Cambria"/>
+                <w:sz w:val="20"/>
+                <w:szCs w:val="20"/>
+              </w:rPr>
+              <w:t xml:space="preserve">$209.10/mo</w:t>
+            </w:r>
+          </w:p>
+        </w:tc>
+        <w:tc>
+          <w:tcPr>
+            <w:tcW w:type="dxa" w:w="2340"/>
+            <w:tcBorders>
+              <w:top w:val="none" w:color="FFFFFF" w:sz="0"/>
+              <w:left w:val="none" w:color="FFFFFF" w:sz="0"/>
+              <w:bottom w:val="none" w:color="FFFFFF" w:sz="0"/>
+              <w:right w:val="none" w:color="FFFFFF" w:sz="0"/>
+            </w:tcBorders>
+            <w:shd w:fill="F8FBFF" w:color="auto" w:val="clear"/>
+          </w:tcPr>
+          <w:p>
+            <w:r>
+              <w:rPr>
+                <w:rFonts w:ascii="Cambria" w:cs="Cambria" w:eastAsia="Cambria" w:hAnsi="Cambria"/>
+                <w:sz w:val="20"/>
+                <w:szCs w:val="20"/>
+              </w:rPr>
+              <w:t xml:space="preserve">$278.80/mo</w:t>
+            </w:r>
+          </w:p>
+        </w:tc>
+      </w:tr>
+      <w:tr>
+        <w:tc>
+          <w:tcPr>
+            <w:tcW w:type="dxa" w:w="2340"/>
+            <w:tcBorders>
+              <w:top w:val="none" w:color="FFFFFF" w:sz="0"/>
+              <w:left w:val="none" w:color="FFFFFF" w:sz="0"/>
+              <w:bottom w:val="none" w:color="FFFFFF" w:sz="0"/>
+              <w:right w:val="none" w:color="FFFFFF" w:sz="0"/>
+            </w:tcBorders>
+            <w:shd w:fill="FFFFFF" w:color="auto" w:val="clear"/>
+          </w:tcPr>
+          <w:p>
+            <w:r>
+              <w:rPr>
+                <w:rFonts w:ascii="Cambria" w:cs="Cambria" w:eastAsia="Cambria" w:hAnsi="Cambria"/>
+                <w:sz w:val="20"/>
+                <w:szCs w:val="20"/>
+              </w:rPr>
+              <w:t xml:space="preserve">Accelerate™ ($1,497/mo)</w:t>
+            </w:r>
+          </w:p>
+        </w:tc>
+        <w:tc>
+          <w:tcPr>
+            <w:tcW w:type="dxa" w:w="2340"/>
+            <w:tcBorders>
+              <w:top w:val="none" w:color="FFFFFF" w:sz="0"/>
+              <w:left w:val="none" w:color="FFFFFF" w:sz="0"/>
+              <w:bottom w:val="none" w:color="FFFFFF" w:sz="0"/>
+              <w:right w:val="none" w:color="FFFFFF" w:sz="0"/>
+            </w:tcBorders>
+            <w:shd w:fill="FFFFFF" w:color="auto" w:val="clear"/>
+          </w:tcPr>
+          <w:p>
+            <w:r>
+              <w:rPr>
+                <w:rFonts w:ascii="Cambria" w:cs="Cambria" w:eastAsia="Cambria" w:hAnsi="Cambria"/>
+                <w:sz w:val="20"/>
+                <w:szCs w:val="20"/>
+              </w:rPr>
+              <w:t xml:space="preserve">$299.40/mo</w:t>
+            </w:r>
+          </w:p>
+        </w:tc>
+        <w:tc>
+          <w:tcPr>
+            <w:tcW w:type="dxa" w:w="2340"/>
+            <w:tcBorders>
+              <w:top w:val="none" w:color="FFFFFF" w:sz="0"/>
+              <w:left w:val="none" w:color="FFFFFF" w:sz="0"/>
+              <w:bottom w:val="none" w:color="FFFFFF" w:sz="0"/>
+              <w:right w:val="none" w:color="FFFFFF" w:sz="0"/>
+            </w:tcBorders>
+            <w:shd w:fill="FFFFFF" w:color="auto" w:val="clear"/>
+          </w:tcPr>
+          <w:p>
+            <w:r>
+              <w:rPr>
+                <w:rFonts w:ascii="Cambria" w:cs="Cambria" w:eastAsia="Cambria" w:hAnsi="Cambria"/>
+                <w:sz w:val="20"/>
+                <w:szCs w:val="20"/>
+              </w:rPr>
+              <w:t xml:space="preserve">$449.10/mo</w:t>
+            </w:r>
+          </w:p>
+        </w:tc>
+        <w:tc>
+          <w:tcPr>
+            <w:tcW w:type="dxa" w:w="2340"/>
+            <w:tcBorders>
+              <w:top w:val="none" w:color="FFFFFF" w:sz="0"/>
+              <w:left w:val="none" w:color="FFFFFF" w:sz="0"/>
+              <w:bottom w:val="none" w:color="FFFFFF" w:sz="0"/>
+              <w:right w:val="none" w:color="FFFFFF" w:sz="0"/>
+            </w:tcBorders>
+            <w:shd w:fill="FFFFFF" w:color="auto" w:val="clear"/>
+          </w:tcPr>
+          <w:p>
+            <w:r>
+              <w:rPr>
+                <w:rFonts w:ascii="Cambria" w:cs="Cambria" w:eastAsia="Cambria" w:hAnsi="Cambria"/>
+                <w:sz w:val="20"/>
+                <w:szCs w:val="20"/>
+              </w:rPr>
+              <w:t xml:space="preserve">$598.80/mo</w:t>
+            </w:r>
+          </w:p>
+        </w:tc>
+      </w:tr>
+      <w:tr>
+        <w:tc>
+          <w:tcPr>
+            <w:tcW w:type="dxa" w:w="2340"/>
+            <w:tcBorders>
+              <w:top w:val="none" w:color="FFFFFF" w:sz="0"/>
+              <w:left w:val="none" w:color="FFFFFF" w:sz="0"/>
+              <w:bottom w:val="none" w:color="FFFFFF" w:sz="0"/>
+              <w:right w:val="none" w:color="FFFFFF" w:sz="0"/>
+            </w:tcBorders>
+            <w:shd w:fill="F8FBFF" w:color="auto" w:val="clear"/>
+          </w:tcPr>
+          <w:p>
+            <w:r>
+              <w:rPr>
+                <w:rFonts w:ascii="Cambria" w:cs="Cambria" w:eastAsia="Cambria" w:hAnsi="Cambria"/>
+                <w:sz w:val="20"/>
+                <w:szCs w:val="20"/>
+              </w:rPr>
+              <w:t xml:space="preserve">Foundation Plan™ /month ($59)</w:t>
             </w:r>
           </w:p>
         </w:tc>
@@ -13900,7 +13900,7 @@
                 <w:sz w:val="20"/>
                 <w:szCs w:val="20"/>
               </w:rPr>
-              <w:t xml:space="preserve">CRM Lite /month ($99)</w:t>
+              <w:t xml:space="preserve">Growth Plan™ /month ($99)</w:t>
             </w:r>
           </w:p>
         </w:tc>
@@ -13990,7 +13990,7 @@
                 <w:sz w:val="20"/>
                 <w:szCs w:val="20"/>
               </w:rPr>
-              <w:t xml:space="preserve">CRM Premium /month ($179)</w:t>
+              <w:t xml:space="preserve">Founder Plan™ /month ($199)</w:t>
             </w:r>
           </w:p>
         </w:tc>
@@ -14034,53 +14034,53 @@
                 <w:sz w:val="20"/>
                 <w:szCs w:val="20"/>
               </w:rPr>
-              <w:t xml:space="preserve">$26.85/mo</w:t>
-            </w:r>
-          </w:p>
-        </w:tc>
-        <w:tc>
-          <w:tcPr>
-            <w:tcW w:type="dxa" w:w="2340"/>
-            <w:tcBorders>
-              <w:top w:val="none" w:color="FFFFFF" w:sz="0"/>
-              <w:left w:val="none" w:color="FFFFFF" w:sz="0"/>
-              <w:bottom w:val="none" w:color="FFFFFF" w:sz="0"/>
-              <w:right w:val="none" w:color="FFFFFF" w:sz="0"/>
-            </w:tcBorders>
-            <w:shd w:fill="F8FBFF" w:color="auto" w:val="clear"/>
-          </w:tcPr>
-          <w:p>
-            <w:r>
-              <w:rPr>
-                <w:rFonts w:ascii="Cambria" w:cs="Cambria" w:eastAsia="Cambria" w:hAnsi="Cambria"/>
-                <w:sz w:val="20"/>
-                <w:szCs w:val="20"/>
-              </w:rPr>
-              <w:t xml:space="preserve">$35.80/mo</w:t>
-            </w:r>
-          </w:p>
-        </w:tc>
-      </w:tr>
-      <w:tr>
-        <w:tc>
-          <w:tcPr>
-            <w:tcW w:type="dxa" w:w="2340"/>
-            <w:tcBorders>
-              <w:top w:val="none" w:color="FFFFFF" w:sz="0"/>
-              <w:left w:val="none" w:color="FFFFFF" w:sz="0"/>
-              <w:bottom w:val="none" w:color="FFFFFF" w:sz="0"/>
-              <w:right w:val="none" w:color="FFFFFF" w:sz="0"/>
-            </w:tcBorders>
-            <w:shd w:fill="FFFFFF" w:color="auto" w:val="clear"/>
-          </w:tcPr>
-          <w:p>
-            <w:r>
-              <w:rPr>
-                <w:rFonts w:ascii="Cambria" w:cs="Cambria" w:eastAsia="Cambria" w:hAnsi="Cambria"/>
-                <w:sz w:val="20"/>
-                <w:szCs w:val="20"/>
-              </w:rPr>
-              <w:t xml:space="preserve">CRM Enterprise /month ($499)</w:t>
+              <w:t xml:space="preserve">$39.80/mo</w:t>
+            </w:r>
+          </w:p>
+        </w:tc>
+        <w:tc>
+          <w:tcPr>
+            <w:tcW w:type="dxa" w:w="2340"/>
+            <w:tcBorders>
+              <w:top w:val="none" w:color="FFFFFF" w:sz="0"/>
+              <w:left w:val="none" w:color="FFFFFF" w:sz="0"/>
+              <w:bottom w:val="none" w:color="FFFFFF" w:sz="0"/>
+              <w:right w:val="none" w:color="FFFFFF" w:sz="0"/>
+            </w:tcBorders>
+            <w:shd w:fill="F8FBFF" w:color="auto" w:val="clear"/>
+          </w:tcPr>
+          <w:p>
+            <w:r>
+              <w:rPr>
+                <w:rFonts w:ascii="Cambria" w:cs="Cambria" w:eastAsia="Cambria" w:hAnsi="Cambria"/>
+                <w:sz w:val="20"/>
+                <w:szCs w:val="20"/>
+              </w:rPr>
+              <w:t xml:space="preserve">$39.80/mo</w:t>
+            </w:r>
+          </w:p>
+        </w:tc>
+      </w:tr>
+      <w:tr>
+        <w:tc>
+          <w:tcPr>
+            <w:tcW w:type="dxa" w:w="2340"/>
+            <w:tcBorders>
+              <w:top w:val="none" w:color="FFFFFF" w:sz="0"/>
+              <w:left w:val="none" w:color="FFFFFF" w:sz="0"/>
+              <w:bottom w:val="none" w:color="FFFFFF" w:sz="0"/>
+              <w:right w:val="none" w:color="FFFFFF" w:sz="0"/>
+            </w:tcBorders>
+            <w:shd w:fill="FFFFFF" w:color="auto" w:val="clear"/>
+          </w:tcPr>
+          <w:p>
+            <w:r>
+              <w:rPr>
+                <w:rFonts w:ascii="Cambria" w:cs="Cambria" w:eastAsia="Cambria" w:hAnsi="Cambria"/>
+                <w:sz w:val="20"/>
+                <w:szCs w:val="20"/>
+              </w:rPr>
+              <w:t xml:space="preserve">Enterprise Plan™ /month ($399)</w:t>
             </w:r>
           </w:p>
         </w:tc>
@@ -14124,53 +14124,53 @@
                 <w:sz w:val="20"/>
                 <w:szCs w:val="20"/>
               </w:rPr>
-              <w:t xml:space="preserve">$74.85/mo</w:t>
-            </w:r>
-          </w:p>
-        </w:tc>
-        <w:tc>
-          <w:tcPr>
-            <w:tcW w:type="dxa" w:w="2340"/>
-            <w:tcBorders>
-              <w:top w:val="none" w:color="FFFFFF" w:sz="0"/>
-              <w:left w:val="none" w:color="FFFFFF" w:sz="0"/>
-              <w:bottom w:val="none" w:color="FFFFFF" w:sz="0"/>
-              <w:right w:val="none" w:color="FFFFFF" w:sz="0"/>
-            </w:tcBorders>
-            <w:shd w:fill="FFFFFF" w:color="auto" w:val="clear"/>
-          </w:tcPr>
-          <w:p>
-            <w:r>
-              <w:rPr>
-                <w:rFonts w:ascii="Cambria" w:cs="Cambria" w:eastAsia="Cambria" w:hAnsi="Cambria"/>
-                <w:sz w:val="20"/>
-                <w:szCs w:val="20"/>
-              </w:rPr>
-              <w:t xml:space="preserve">$99.80/mo</w:t>
-            </w:r>
-          </w:p>
-        </w:tc>
-      </w:tr>
-      <w:tr>
-        <w:tc>
-          <w:tcPr>
-            <w:tcW w:type="dxa" w:w="2340"/>
-            <w:tcBorders>
-              <w:top w:val="none" w:color="FFFFFF" w:sz="0"/>
-              <w:left w:val="none" w:color="FFFFFF" w:sz="0"/>
-              <w:bottom w:val="none" w:color="FFFFFF" w:sz="0"/>
-              <w:right w:val="none" w:color="FFFFFF" w:sz="0"/>
-            </w:tcBorders>
-            <w:shd w:fill="F8FBFF" w:color="auto" w:val="clear"/>
-          </w:tcPr>
-          <w:p>
-            <w:r>
-              <w:rPr>
-                <w:rFonts w:ascii="Cambria" w:cs="Cambria" w:eastAsia="Cambria" w:hAnsi="Cambria"/>
-                <w:sz w:val="20"/>
-                <w:szCs w:val="20"/>
-              </w:rPr>
-              <w:t xml:space="preserve">White-Label /month ($697)</w:t>
+              <w:t xml:space="preserve">$79.80/mo</w:t>
+            </w:r>
+          </w:p>
+        </w:tc>
+        <w:tc>
+          <w:tcPr>
+            <w:tcW w:type="dxa" w:w="2340"/>
+            <w:tcBorders>
+              <w:top w:val="none" w:color="FFFFFF" w:sz="0"/>
+              <w:left w:val="none" w:color="FFFFFF" w:sz="0"/>
+              <w:bottom w:val="none" w:color="FFFFFF" w:sz="0"/>
+              <w:right w:val="none" w:color="FFFFFF" w:sz="0"/>
+            </w:tcBorders>
+            <w:shd w:fill="FFFFFF" w:color="auto" w:val="clear"/>
+          </w:tcPr>
+          <w:p>
+            <w:r>
+              <w:rPr>
+                <w:rFonts w:ascii="Cambria" w:cs="Cambria" w:eastAsia="Cambria" w:hAnsi="Cambria"/>
+                <w:sz w:val="20"/>
+                <w:szCs w:val="20"/>
+              </w:rPr>
+              <w:t xml:space="preserve">$79.80/mo</w:t>
+            </w:r>
+          </w:p>
+        </w:tc>
+      </w:tr>
+      <w:tr>
+        <w:tc>
+          <w:tcPr>
+            <w:tcW w:type="dxa" w:w="2340"/>
+            <w:tcBorders>
+              <w:top w:val="none" w:color="FFFFFF" w:sz="0"/>
+              <w:left w:val="none" w:color="FFFFFF" w:sz="0"/>
+              <w:bottom w:val="none" w:color="FFFFFF" w:sz="0"/>
+              <w:right w:val="none" w:color="FFFFFF" w:sz="0"/>
+            </w:tcBorders>
+            <w:shd w:fill="F8FBFF" w:color="auto" w:val="clear"/>
+          </w:tcPr>
+          <w:p>
+            <w:r>
+              <w:rPr>
+                <w:rFonts w:ascii="Cambria" w:cs="Cambria" w:eastAsia="Cambria" w:hAnsi="Cambria"/>
+                <w:sz w:val="20"/>
+                <w:szCs w:val="20"/>
+              </w:rPr>
+              <w:t xml:space="preserve">Agency Edition™ /month ($899)</w:t>
             </w:r>
           </w:p>
         </w:tc>
@@ -14214,29 +14214,29 @@
                 <w:sz w:val="20"/>
                 <w:szCs w:val="20"/>
               </w:rPr>
-              <w:t xml:space="preserve">$104.55/mo</w:t>
-            </w:r>
-          </w:p>
-        </w:tc>
-        <w:tc>
-          <w:tcPr>
-            <w:tcW w:type="dxa" w:w="2340"/>
-            <w:tcBorders>
-              <w:top w:val="none" w:color="FFFFFF" w:sz="0"/>
-              <w:left w:val="none" w:color="FFFFFF" w:sz="0"/>
-              <w:bottom w:val="none" w:color="FFFFFF" w:sz="0"/>
-              <w:right w:val="none" w:color="FFFFFF" w:sz="0"/>
-            </w:tcBorders>
-            <w:shd w:fill="F8FBFF" w:color="auto" w:val="clear"/>
-          </w:tcPr>
-          <w:p>
-            <w:r>
-              <w:rPr>
-                <w:rFonts w:ascii="Cambria" w:cs="Cambria" w:eastAsia="Cambria" w:hAnsi="Cambria"/>
-                <w:sz w:val="20"/>
-                <w:szCs w:val="20"/>
-              </w:rPr>
-              <w:t xml:space="preserve">$139.40/mo</w:t>
+              <w:t xml:space="preserve">$179.80/mo</w:t>
+            </w:r>
+          </w:p>
+        </w:tc>
+        <w:tc>
+          <w:tcPr>
+            <w:tcW w:type="dxa" w:w="2340"/>
+            <w:tcBorders>
+              <w:top w:val="none" w:color="FFFFFF" w:sz="0"/>
+              <w:left w:val="none" w:color="FFFFFF" w:sz="0"/>
+              <w:bottom w:val="none" w:color="FFFFFF" w:sz="0"/>
+              <w:right w:val="none" w:color="FFFFFF" w:sz="0"/>
+            </w:tcBorders>
+            <w:shd w:fill="F8FBFF" w:color="auto" w:val="clear"/>
+          </w:tcPr>
+          <w:p>
+            <w:r>
+              <w:rPr>
+                <w:rFonts w:ascii="Cambria" w:cs="Cambria" w:eastAsia="Cambria" w:hAnsi="Cambria"/>
+                <w:sz w:val="20"/>
+                <w:szCs w:val="20"/>
+              </w:rPr>
+              <w:t xml:space="preserve">$179.80/mo</w:t>
             </w:r>
           </w:p>
         </w:tc>
@@ -16236,7 +16236,7 @@
       <w:pPr>
         <w:jc w:val="center"/>
       </w:pPr>
-      <w:hyperlink w:history="1" r:id="rIdwpppuihr3wef8xjb4lmxx">
+      <w:hyperlink w:history="1" r:id="rIdf4rkd-c-j66ljakq5vtt5">
         <w:r>
           <w:rPr>
             <w:rStyle w:val="Hyperlink"/>

</xml_diff>